<commit_message>
DOC: modificação da documentação
</commit_message>
<xml_diff>
--- a/documentacao/Documentação - Copia.docx
+++ b/documentacao/Documentação - Copia.docx
@@ -2971,6 +2971,164 @@
     <w:p>
       <w:pPr>
         <w:spacing w:after="0" w:line="360" w:lineRule="auto"/>
+        <w:outlineLvl w:val="0"/>
+        <w:rPr>
+          <w:rFonts w:ascii="Times New Roman" w:hAnsi="Times New Roman" w:cs="Times New Roman"/>
+          <w:sz w:val="24"/>
+          <w:szCs w:val="24"/>
+        </w:rPr>
+      </w:pPr>
+      <w:r>
+        <w:rPr>
+          <w:rFonts w:ascii="Times New Roman" w:hAnsi="Times New Roman" w:cs="Times New Roman"/>
+          <w:sz w:val="24"/>
+          <w:szCs w:val="24"/>
+        </w:rPr>
+        <w:t xml:space="preserve">O </w:t>
+      </w:r>
+      <w:r>
+        <w:rPr>
+          <w:rFonts w:ascii="Times New Roman" w:hAnsi="Times New Roman" w:cs="Times New Roman"/>
+          <w:sz w:val="24"/>
+          <w:szCs w:val="24"/>
+        </w:rPr>
+        <w:t xml:space="preserve">site promove </w:t>
+      </w:r>
+      <w:r>
+        <w:rPr>
+          <w:rFonts w:ascii="Times New Roman" w:hAnsi="Times New Roman" w:cs="Times New Roman"/>
+          <w:sz w:val="24"/>
+          <w:szCs w:val="24"/>
+        </w:rPr>
+        <w:t xml:space="preserve">praticidade </w:t>
+      </w:r>
+      <w:r>
+        <w:rPr>
+          <w:rFonts w:ascii="Times New Roman" w:hAnsi="Times New Roman" w:cs="Times New Roman"/>
+          <w:sz w:val="24"/>
+          <w:szCs w:val="24"/>
+        </w:rPr>
+        <w:t xml:space="preserve">e </w:t>
+      </w:r>
+      <w:r>
+        <w:rPr>
+          <w:rFonts w:ascii="Times New Roman" w:hAnsi="Times New Roman" w:cs="Times New Roman"/>
+          <w:sz w:val="24"/>
+          <w:szCs w:val="24"/>
+        </w:rPr>
+        <w:t>autonomia nas compras e atendimentos online, através da criação de website que visa alcançar um bom atendimento que auxilia a vida de quem se preocupa com o bem-estar do seu pet. Oferecendo informações claras sobre local, formas de entrega, atendimento ao cliente, contatos</w:t>
+      </w:r>
+      <w:r>
+        <w:rPr>
+          <w:rFonts w:ascii="Times New Roman" w:hAnsi="Times New Roman" w:cs="Times New Roman"/>
+          <w:sz w:val="24"/>
+          <w:szCs w:val="24"/>
+        </w:rPr>
+        <w:t xml:space="preserve"> e garantia.</w:t>
+      </w:r>
+    </w:p>
+    <w:p>
+      <w:pPr>
+        <w:spacing w:after="0" w:line="360" w:lineRule="auto"/>
+        <w:outlineLvl w:val="0"/>
+        <w:rPr>
+          <w:rFonts w:ascii="Times New Roman" w:hAnsi="Times New Roman" w:cs="Times New Roman"/>
+          <w:sz w:val="24"/>
+          <w:szCs w:val="24"/>
+        </w:rPr>
+      </w:pPr>
+      <w:r>
+        <w:rPr>
+          <w:rFonts w:ascii="Times New Roman" w:hAnsi="Times New Roman" w:cs="Times New Roman"/>
+          <w:sz w:val="24"/>
+          <w:szCs w:val="24"/>
+        </w:rPr>
+        <w:t>Para o desenvolvimento</w:t>
+      </w:r>
+      <w:r>
+        <w:rPr>
+          <w:rFonts w:ascii="Times New Roman" w:hAnsi="Times New Roman" w:cs="Times New Roman"/>
+          <w:sz w:val="24"/>
+          <w:szCs w:val="24"/>
+        </w:rPr>
+        <w:t xml:space="preserve"> e organização</w:t>
+      </w:r>
+      <w:r>
+        <w:rPr>
+          <w:rFonts w:ascii="Times New Roman" w:hAnsi="Times New Roman" w:cs="Times New Roman"/>
+          <w:sz w:val="24"/>
+          <w:szCs w:val="24"/>
+        </w:rPr>
+        <w:t xml:space="preserve"> </w:t>
+      </w:r>
+      <w:r>
+        <w:rPr>
+          <w:rFonts w:ascii="Times New Roman" w:hAnsi="Times New Roman" w:cs="Times New Roman"/>
+          <w:sz w:val="24"/>
+          <w:szCs w:val="24"/>
+        </w:rPr>
+        <w:t>do projeto foi utilizado a metodologia ágil (SCRUM), permitindo a flexibilidade e a adaptação contínua ao longo do processo. A construção do site foi realizada através da utilização das linguagens HTML</w:t>
+      </w:r>
+      <w:r>
+        <w:rPr>
+          <w:rFonts w:ascii="Times New Roman" w:hAnsi="Times New Roman" w:cs="Times New Roman"/>
+          <w:sz w:val="24"/>
+          <w:szCs w:val="24"/>
+        </w:rPr>
+        <w:t xml:space="preserve"> e CSS</w:t>
+      </w:r>
+      <w:r>
+        <w:rPr>
+          <w:rFonts w:ascii="Times New Roman" w:hAnsi="Times New Roman" w:cs="Times New Roman"/>
+          <w:sz w:val="24"/>
+          <w:szCs w:val="24"/>
+        </w:rPr>
+        <w:t>, para dar estrutura ao conteúdo</w:t>
+      </w:r>
+      <w:r>
+        <w:rPr>
+          <w:rFonts w:ascii="Times New Roman" w:hAnsi="Times New Roman" w:cs="Times New Roman"/>
+          <w:sz w:val="24"/>
+          <w:szCs w:val="24"/>
+        </w:rPr>
+        <w:t xml:space="preserve">, </w:t>
+      </w:r>
+      <w:r>
+        <w:rPr>
+          <w:rFonts w:ascii="Times New Roman" w:hAnsi="Times New Roman" w:cs="Times New Roman"/>
+          <w:sz w:val="24"/>
+          <w:szCs w:val="24"/>
+        </w:rPr>
+        <w:t xml:space="preserve">organizar </w:t>
+      </w:r>
+      <w:r>
+        <w:rPr>
+          <w:rFonts w:ascii="Times New Roman" w:hAnsi="Times New Roman" w:cs="Times New Roman"/>
+          <w:sz w:val="24"/>
+          <w:szCs w:val="24"/>
+        </w:rPr>
+        <w:t>as páginas</w:t>
+      </w:r>
+      <w:r>
+        <w:rPr>
+          <w:rFonts w:ascii="Times New Roman" w:hAnsi="Times New Roman" w:cs="Times New Roman"/>
+          <w:sz w:val="24"/>
+          <w:szCs w:val="24"/>
+        </w:rPr>
+        <w:t xml:space="preserve"> e estilizar</w:t>
+      </w:r>
+      <w:r>
+        <w:rPr>
+          <w:rFonts w:ascii="Times New Roman" w:hAnsi="Times New Roman" w:cs="Times New Roman"/>
+          <w:sz w:val="24"/>
+          <w:szCs w:val="24"/>
+        </w:rPr>
+        <w:t xml:space="preserve">. Para o backend, foi escolhido a utilização do VsCode, JavaScript utilizando a linguagem C# e o banco de dados para armazenamento dos dados fornecidos.  </w:t>
+      </w:r>
+    </w:p>
+    <w:p>
+      <w:pPr>
+        <w:spacing w:after="0" w:line="360" w:lineRule="auto"/>
         <w:ind w:left="709" w:hanging="709"/>
         <w:outlineLvl w:val="1"/>
         <w:rPr>
@@ -2998,20 +3156,28 @@
         <w:jc w:val="both"/>
         <w:rPr>
           <w:rFonts w:ascii="Times New Roman" w:hAnsi="Times New Roman" w:cs="Times New Roman"/>
-          <w:b/>
-          <w:sz w:val="24"/>
-          <w:szCs w:val="24"/>
-        </w:rPr>
-      </w:pPr>
-      <w:r>
-        <w:rPr>
-          <w:rFonts w:ascii="Times New Roman" w:hAnsi="Times New Roman" w:cs="Times New Roman"/>
-          <w:b/>
-          <w:sz w:val="24"/>
-          <w:szCs w:val="24"/>
-        </w:rPr>
-        <w:t>Apenas 01 objetivo.</w:t>
-      </w:r>
+          <w:sz w:val="24"/>
+          <w:szCs w:val="24"/>
+        </w:rPr>
+      </w:pPr>
+      <w:r>
+        <w:rPr>
+          <w:rFonts w:ascii="Times New Roman" w:hAnsi="Times New Roman" w:cs="Times New Roman"/>
+          <w:sz w:val="24"/>
+          <w:szCs w:val="24"/>
+        </w:rPr>
+        <w:t xml:space="preserve">O objetivo principal do site </w:t>
+      </w:r>
+      <w:r>
+        <w:rPr>
+          <w:rFonts w:ascii="Times New Roman" w:hAnsi="Times New Roman" w:cs="Times New Roman"/>
+          <w:sz w:val="24"/>
+          <w:szCs w:val="24"/>
+        </w:rPr>
+        <w:t xml:space="preserve">é alcançar pessoas que buscam qualidade, confiança e cuidado ao seu animal, oferecer bons atendimentos e produtos, garantindo a saúde dos pets. O objetivo é englobar todos esses princípios em um site de fácil acessibilidade e disponibilidade aos seus clientes. </w:t>
+      </w:r>
+      <w:bookmarkStart w:id="3" w:name="_GoBack"/>
+      <w:bookmarkEnd w:id="3"/>
     </w:p>
     <w:p>
       <w:pPr>
@@ -3025,7 +3191,7 @@
           <w:szCs w:val="24"/>
         </w:rPr>
       </w:pPr>
-      <w:bookmarkStart w:id="3" w:name="_Toc205989571"/>
+      <w:bookmarkStart w:id="4" w:name="_Toc205989571"/>
       <w:r>
         <w:rPr>
           <w:rFonts w:ascii="Times New Roman" w:hAnsi="Times New Roman" w:cs="Times New Roman"/>
@@ -3035,7 +3201,7 @@
         </w:rPr>
         <w:t>2.2 Objetivos específicos</w:t>
       </w:r>
-      <w:bookmarkEnd w:id="3"/>
+      <w:bookmarkEnd w:id="4"/>
     </w:p>
     <w:p>
       <w:pPr>
@@ -3406,7 +3572,7 @@
           <w:szCs w:val="24"/>
         </w:rPr>
       </w:pPr>
-      <w:bookmarkStart w:id="4" w:name="_Toc205989572"/>
+      <w:bookmarkStart w:id="5" w:name="_Toc205989572"/>
       <w:r>
         <w:rPr>
           <w:rFonts w:ascii="Times New Roman" w:hAnsi="Times New Roman" w:cs="Times New Roman"/>
@@ -3416,7 +3582,7 @@
         </w:rPr>
         <w:t>3 METODOLOGIA OU PROCEDIMENTOS METODOLÓGICOS</w:t>
       </w:r>
-      <w:bookmarkEnd w:id="4"/>
+      <w:bookmarkEnd w:id="5"/>
     </w:p>
     <w:p>
       <w:pPr>
@@ -3472,7 +3638,7 @@
           <w:szCs w:val="24"/>
         </w:rPr>
       </w:pPr>
-      <w:bookmarkStart w:id="5" w:name="_Toc205989573"/>
+      <w:bookmarkStart w:id="6" w:name="_Toc205989573"/>
       <w:r>
         <w:rPr>
           <w:rFonts w:ascii="Times New Roman" w:hAnsi="Times New Roman" w:cs="Times New Roman"/>
@@ -3482,8 +3648,6 @@
         </w:rPr>
         <w:t>4 MÉTODOS</w:t>
       </w:r>
-      <w:bookmarkStart w:id="6" w:name="_GoBack"/>
-      <w:bookmarkEnd w:id="5"/>
       <w:bookmarkEnd w:id="6"/>
     </w:p>
     <w:p>
@@ -3618,7 +3782,16 @@
           <w:sz w:val="24"/>
           <w:szCs w:val="24"/>
         </w:rPr>
-        <w:t>, possibilitando acessos rápidos e suporte. A linguagem permitiu a</w:t>
+        <w:t xml:space="preserve">, possibilitando acessos rápidos e </w:t>
+      </w:r>
+      <w:r>
+        <w:rPr>
+          <w:rFonts w:ascii="Times New Roman" w:hAnsi="Times New Roman" w:cs="Times New Roman"/>
+          <w:sz w:val="24"/>
+          <w:szCs w:val="24"/>
+        </w:rPr>
+        <w:lastRenderedPageBreak/>
+        <w:t>suporte. A linguagem permitiu a</w:t>
       </w:r>
       <w:r>
         <w:rPr>
@@ -3844,7 +4017,6 @@
           <w:sz w:val="24"/>
           <w:szCs w:val="24"/>
         </w:rPr>
-        <w:lastRenderedPageBreak/>
         <w:t xml:space="preserve">4.4 </w:t>
       </w:r>
       <w:r>
@@ -5118,6 +5290,7 @@
           <w:rFonts w:ascii="Times New Roman" w:hAnsi="Times New Roman" w:cs="Times New Roman"/>
           <w:b/>
         </w:rPr>
+        <w:lastRenderedPageBreak/>
         <w:t>trabalho (introdução e desenvolvimento). A conclusão deve relacionar, em primeiro</w:t>
       </w:r>
     </w:p>
@@ -6795,7 +6968,7 @@
 </file>
 
 <file path=customXml/itemProps1.xml><?xml version="1.0" encoding="utf-8"?>
-<ds:datastoreItem xmlns:ds="http://schemas.openxmlformats.org/officeDocument/2006/customXml" ds:itemID="{DFDDF0F1-1B52-4C38-97C4-B7CB6729B15F}">
+<ds:datastoreItem xmlns:ds="http://schemas.openxmlformats.org/officeDocument/2006/customXml" ds:itemID="{EBA4A2F8-32F1-4338-A449-38227844FCB1}">
   <ds:schemaRefs>
     <ds:schemaRef ds:uri="http://schemas.openxmlformats.org/officeDocument/2006/bibliography"/>
   </ds:schemaRefs>

</xml_diff>